<commit_message>
Update FONTS USED IN DOCUMENT.docx
</commit_message>
<xml_diff>
--- a/rpt/FONTS USED IN DOCUMENT.docx
+++ b/rpt/FONTS USED IN DOCUMENT.docx
@@ -66,235 +66,55 @@
         <w:t>Page 684 | Style: Normal | Historical Parallels Chart</w:t>
       </w:r>
     </w:p>
-    <w:p>
-      <w:r>
-        <w:t>Page 956 | Style: Normal | 400 years 400 years 120 years 400 years 210 years 400 years</w:t>
-      </w:r>
-    </w:p>
-    <w:p>
-      <w:r>
-        <w:t>Page 956 | Style: Normal | JEWISH HISTORY</w:t>
-      </w:r>
-    </w:p>
-    <w:p>
-      <w:r>
-        <w:t>Page 956 | Style: Normal | JESUS</w:t>
-      </w:r>
-    </w:p>
-    <w:p>
-      <w:r>
-        <w:t>Page 956 | Style: Normal | 392 years 408 years 119 years 390 years 209 years 400 years</w:t>
-      </w:r>
-    </w:p>
-    <w:p>
-      <w:r>
-        <w:t>Page 956 | Style: Normal | CHRISTIAN HISTORY</w:t>
-      </w:r>
-    </w:p>
-    <w:p>
-      <w:r>
-        <w:t>Page 956 | Style: Normal | TODAY</w:t>
-      </w:r>
-    </w:p>
-    <w:p>
-      <w:r>
-        <w:t>Page 956 | Style: Normal | 400 years 400 years 120 years 400 years 210 years 400 years</w:t>
-      </w:r>
-    </w:p>
-    <w:p>
-      <w:r>
-        <w:t>Page 956 | Style: Normal | JEWISH HISTORY</w:t>
-      </w:r>
-    </w:p>
-    <w:p>
-      <w:r>
-        <w:t>Page 956 | Style: Normal | JESUS</w:t>
-      </w:r>
-    </w:p>
-    <w:p>
-      <w:r>
-        <w:t>Page 956 | Style: Normal | 392 years 408 years 119 years 390 years 209 years 400 years</w:t>
+    <w:p/>
+    <w:p>
+      <w:r>
+        <w:t>TIMES NEW ROMAN</w:t>
+      </w:r>
+    </w:p>
+    <w:p>
+      <w:r>
+        <w:t>--------------------</w:t>
+      </w:r>
+    </w:p>
+    <w:p>
+      <w:r>
+        <w:t>Page 1 | Style: Title | HOLY BIBLE</w:t>
+      </w:r>
+    </w:p>
+    <w:p>
+      <w:r>
+        <w:t>Page 19 | Style: Title | The Hebrew Bible</w:t>
+      </w:r>
+    </w:p>
+    <w:p>
+      <w:r>
+        <w:t>Page 3 | Style: Normal | Genesis (Gen) page 19</w:t>
+      </w:r>
+    </w:p>
+    <w:p>
+      <w:r>
+        <w:t>Page 3 | Style: Normal | Exodus (Exod) 61</w:t>
+      </w:r>
+    </w:p>
+    <w:p>
+      <w:r>
+        <w:t>Page 3 | Style: Normal | Leviticus (Lev) 94</w:t>
+      </w:r>
+    </w:p>
+    <w:p>
+      <w:r>
+        <w:t>Page 3 | Style: Normal | Numbers (Num) 118</w:t>
+      </w:r>
+    </w:p>
+    <w:p>
+      <w:r>
+        <w:t>Page 3 | Style: Normal | Deuteronomy (Deut) 152</w:t>
       </w:r>
     </w:p>
     <w:p>
       <w:r>
         <w:lastRenderedPageBreak/>
-        <w:t>Page 956 | Style: Normal | CHRISTIAN HISTORY</w:t>
-      </w:r>
-    </w:p>
-    <w:p>
-      <w:r>
-        <w:t>Page 956 | Style: Normal | TODAY</w:t>
-      </w:r>
-    </w:p>
-    <w:p>
-      <w:r>
-        <w:t>Page 956 | Style: Normal | 400 years 400 years 120 years 400 years 210 years 400 years</w:t>
-      </w:r>
-    </w:p>
-    <w:p>
-      <w:r>
-        <w:t>Page 956 | Style: Normal | JEWISH HISTORY</w:t>
-      </w:r>
-    </w:p>
-    <w:p>
-      <w:r>
-        <w:t>Page 956 | Style: Normal | JESUS</w:t>
-      </w:r>
-    </w:p>
-    <w:p>
-      <w:r>
-        <w:t>Page 956 | Style: Normal | 392 years 408 years 119 years 390 years 209 years 400 years</w:t>
-      </w:r>
-    </w:p>
-    <w:p>
-      <w:r>
-        <w:t>Page 956 | Style: Normal | CHRISTIAN HISTORY</w:t>
-      </w:r>
-    </w:p>
-    <w:p>
-      <w:r>
-        <w:t>Page 956 | Style: Normal | TODAY</w:t>
-      </w:r>
-    </w:p>
-    <w:p>
-      <w:r>
-        <w:t>Page 957 | Style: Normal | 400 years 400 years 120 years 400 years 210 years 400 years</w:t>
-      </w:r>
-    </w:p>
-    <w:p>
-      <w:r>
-        <w:t>Page 957 | Style: Normal | JEWISH HISTORY</w:t>
-      </w:r>
-    </w:p>
-    <w:p>
-      <w:r>
-        <w:t>Page 957 | Style: Normal | JESUS</w:t>
-      </w:r>
-    </w:p>
-    <w:p>
-      <w:r>
-        <w:t>Page 957 | Style: Normal | 392 years 408 years 119 years 390 years 209 years 400 years</w:t>
-      </w:r>
-    </w:p>
-    <w:p>
-      <w:r>
-        <w:t>Page 957 | Style: Normal | CHRISTIAN HISTORY</w:t>
-      </w:r>
-    </w:p>
-    <w:p>
-      <w:r>
-        <w:t>Page 957 | Style: Normal | TODAY</w:t>
-      </w:r>
-    </w:p>
-    <w:p>
-      <w:r>
-        <w:t>Page 957 | Style: Normal | 400 years 400 years 120 years 400 years 210 years 400 years</w:t>
-      </w:r>
-    </w:p>
-    <w:p>
-      <w:r>
-        <w:t>Page 957 | Style: Normal | JEWISH HISTORY</w:t>
-      </w:r>
-    </w:p>
-    <w:p>
-      <w:r>
-        <w:t>Page 957 | Style: Normal | JESUS</w:t>
-      </w:r>
-    </w:p>
-    <w:p>
-      <w:r>
-        <w:t>Page 957 | Style: Normal | 392 years 408 years 119 years 390 years 209 years 400 years</w:t>
-      </w:r>
-    </w:p>
-    <w:p>
-      <w:r>
-        <w:t>Page 957 | Style: Normal | CHRISTIAN HISTORY</w:t>
-      </w:r>
-    </w:p>
-    <w:p>
-      <w:r>
-        <w:t>Page 957 | Style: Normal | TODAY</w:t>
-      </w:r>
-    </w:p>
-    <w:p>
-      <w:r>
-        <w:t>Page 957 | Style: Normal | 400 years 400 years 120 years 400 years 210 years 400 years</w:t>
-      </w:r>
-    </w:p>
-    <w:p>
-      <w:r>
-        <w:t>Page 957 | Style: Normal | JEWISH HISTORY</w:t>
-      </w:r>
-    </w:p>
-    <w:p>
-      <w:r>
-        <w:t>Page 957 | Style: Normal | JESUS</w:t>
-      </w:r>
-    </w:p>
-    <w:p>
-      <w:r>
-        <w:t>Page 957 | Style: Normal | 392 years 408 years 119 years 390 years 209 years 400 years</w:t>
-      </w:r>
-    </w:p>
-    <w:p>
-      <w:r>
-        <w:t>Page 957 | Style: Normal | CHRISTIAN HISTORY</w:t>
-      </w:r>
-    </w:p>
-    <w:p>
-      <w:r>
-        <w:t>Page 957 | Style: Normal | TODAY</w:t>
-      </w:r>
-    </w:p>
-    <w:p/>
-    <w:p>
-      <w:r>
-        <w:t>TIMES NEW ROMAN</w:t>
-      </w:r>
-    </w:p>
-    <w:p>
-      <w:r>
-        <w:t>--------------------</w:t>
-      </w:r>
-    </w:p>
-    <w:p>
-      <w:r>
-        <w:t>Page 1 | Style: Title | HOLY BIBLE</w:t>
-      </w:r>
-    </w:p>
-    <w:p>
-      <w:r>
-        <w:t>Page 19 | Style: Title | The Hebrew Bible</w:t>
-      </w:r>
-    </w:p>
-    <w:p>
-      <w:r>
-        <w:t>Page 3 | Style: Normal | Genesis (Gen) page 19</w:t>
-      </w:r>
-    </w:p>
-    <w:p>
-      <w:r>
-        <w:t>Page 3 | Style: Normal | Exodus (Exod) 61</w:t>
-      </w:r>
-    </w:p>
-    <w:p>
-      <w:r>
-        <w:t>Page 3 | Style: Normal | Leviticus (Lev) 94</w:t>
-      </w:r>
-    </w:p>
-    <w:p>
-      <w:r>
-        <w:t>Page 3 | Style: Normal | Numbers (Num) 118</w:t>
-      </w:r>
-    </w:p>
-    <w:p>
-      <w:r>
-        <w:t>Page 3 | Style: Normal | Deuteronomy (Deut) 152</w:t>
-      </w:r>
-    </w:p>
-    <w:p>
-      <w:r>
         <w:t>Page 3 | Style: Normal | Joshua (Josh) 181</w:t>
       </w:r>
     </w:p>
@@ -375,7 +195,6 @@
     </w:p>
     <w:p>
       <w:r>
-        <w:lastRenderedPageBreak/>
         <w:t>Page 3 | Style: Normal | Solomon (Song) 449</w:t>
       </w:r>
     </w:p>
@@ -506,7 +325,6 @@
     </w:p>
     <w:p>
       <w:r>
-        <w:lastRenderedPageBreak/>
         <w:t>Page 3 | Style: Normal | Galatians (Gal) 782</w:t>
       </w:r>
     </w:p>
@@ -1035,7 +853,7 @@
     <w:link w:val="Heading1Char"/>
     <w:uiPriority w:val="9"/>
     <w:qFormat/>
-    <w:rsid w:val="00BE68EB"/>
+    <w:rsid w:val="00D460B1"/>
     <w:pPr>
       <w:keepNext/>
       <w:keepLines/>
@@ -1058,7 +876,7 @@
     <w:semiHidden/>
     <w:unhideWhenUsed/>
     <w:qFormat/>
-    <w:rsid w:val="00BE68EB"/>
+    <w:rsid w:val="00D460B1"/>
     <w:pPr>
       <w:keepNext/>
       <w:keepLines/>
@@ -1081,7 +899,7 @@
     <w:semiHidden/>
     <w:unhideWhenUsed/>
     <w:qFormat/>
-    <w:rsid w:val="00BE68EB"/>
+    <w:rsid w:val="00D460B1"/>
     <w:pPr>
       <w:keepNext/>
       <w:keepLines/>
@@ -1104,7 +922,7 @@
     <w:semiHidden/>
     <w:unhideWhenUsed/>
     <w:qFormat/>
-    <w:rsid w:val="00BE68EB"/>
+    <w:rsid w:val="00D460B1"/>
     <w:pPr>
       <w:keepNext/>
       <w:keepLines/>
@@ -1127,7 +945,7 @@
     <w:semiHidden/>
     <w:unhideWhenUsed/>
     <w:qFormat/>
-    <w:rsid w:val="00BE68EB"/>
+    <w:rsid w:val="00D460B1"/>
     <w:pPr>
       <w:keepNext/>
       <w:keepLines/>
@@ -1148,7 +966,7 @@
     <w:semiHidden/>
     <w:unhideWhenUsed/>
     <w:qFormat/>
-    <w:rsid w:val="00BE68EB"/>
+    <w:rsid w:val="00D460B1"/>
     <w:pPr>
       <w:keepNext/>
       <w:keepLines/>
@@ -1171,7 +989,7 @@
     <w:semiHidden/>
     <w:unhideWhenUsed/>
     <w:qFormat/>
-    <w:rsid w:val="00BE68EB"/>
+    <w:rsid w:val="00D460B1"/>
     <w:pPr>
       <w:keepNext/>
       <w:keepLines/>
@@ -1192,7 +1010,7 @@
     <w:semiHidden/>
     <w:unhideWhenUsed/>
     <w:qFormat/>
-    <w:rsid w:val="00BE68EB"/>
+    <w:rsid w:val="00D460B1"/>
     <w:pPr>
       <w:keepNext/>
       <w:keepLines/>
@@ -1215,7 +1033,7 @@
     <w:semiHidden/>
     <w:unhideWhenUsed/>
     <w:qFormat/>
-    <w:rsid w:val="00BE68EB"/>
+    <w:rsid w:val="00D460B1"/>
     <w:pPr>
       <w:keepNext/>
       <w:keepLines/>
@@ -1259,7 +1077,7 @@
     <w:basedOn w:val="DefaultParagraphFont"/>
     <w:link w:val="Heading1"/>
     <w:uiPriority w:val="9"/>
-    <w:rsid w:val="00BE68EB"/>
+    <w:rsid w:val="00D460B1"/>
     <w:rPr>
       <w:rFonts w:asciiTheme="majorHAnsi" w:eastAsiaTheme="majorEastAsia" w:hAnsiTheme="majorHAnsi" w:cstheme="majorBidi"/>
       <w:color w:val="0F4761" w:themeColor="accent1" w:themeShade="BF"/>
@@ -1273,7 +1091,7 @@
     <w:link w:val="Heading2"/>
     <w:uiPriority w:val="9"/>
     <w:semiHidden/>
-    <w:rsid w:val="00BE68EB"/>
+    <w:rsid w:val="00D460B1"/>
     <w:rPr>
       <w:rFonts w:asciiTheme="majorHAnsi" w:eastAsiaTheme="majorEastAsia" w:hAnsiTheme="majorHAnsi" w:cstheme="majorBidi"/>
       <w:color w:val="0F4761" w:themeColor="accent1" w:themeShade="BF"/>
@@ -1287,7 +1105,7 @@
     <w:link w:val="Heading3"/>
     <w:uiPriority w:val="9"/>
     <w:semiHidden/>
-    <w:rsid w:val="00BE68EB"/>
+    <w:rsid w:val="00D460B1"/>
     <w:rPr>
       <w:rFonts w:eastAsiaTheme="majorEastAsia" w:cstheme="majorBidi"/>
       <w:color w:val="0F4761" w:themeColor="accent1" w:themeShade="BF"/>
@@ -1301,7 +1119,7 @@
     <w:link w:val="Heading4"/>
     <w:uiPriority w:val="9"/>
     <w:semiHidden/>
-    <w:rsid w:val="00BE68EB"/>
+    <w:rsid w:val="00D460B1"/>
     <w:rPr>
       <w:rFonts w:eastAsiaTheme="majorEastAsia" w:cstheme="majorBidi"/>
       <w:i/>
@@ -1315,7 +1133,7 @@
     <w:link w:val="Heading5"/>
     <w:uiPriority w:val="9"/>
     <w:semiHidden/>
-    <w:rsid w:val="00BE68EB"/>
+    <w:rsid w:val="00D460B1"/>
     <w:rPr>
       <w:rFonts w:eastAsiaTheme="majorEastAsia" w:cstheme="majorBidi"/>
       <w:color w:val="0F4761" w:themeColor="accent1" w:themeShade="BF"/>
@@ -1327,7 +1145,7 @@
     <w:link w:val="Heading6"/>
     <w:uiPriority w:val="9"/>
     <w:semiHidden/>
-    <w:rsid w:val="00BE68EB"/>
+    <w:rsid w:val="00D460B1"/>
     <w:rPr>
       <w:rFonts w:eastAsiaTheme="majorEastAsia" w:cstheme="majorBidi"/>
       <w:i/>
@@ -1341,7 +1159,7 @@
     <w:link w:val="Heading7"/>
     <w:uiPriority w:val="9"/>
     <w:semiHidden/>
-    <w:rsid w:val="00BE68EB"/>
+    <w:rsid w:val="00D460B1"/>
     <w:rPr>
       <w:rFonts w:eastAsiaTheme="majorEastAsia" w:cstheme="majorBidi"/>
       <w:color w:val="595959" w:themeColor="text1" w:themeTint="A6"/>
@@ -1353,7 +1171,7 @@
     <w:link w:val="Heading8"/>
     <w:uiPriority w:val="9"/>
     <w:semiHidden/>
-    <w:rsid w:val="00BE68EB"/>
+    <w:rsid w:val="00D460B1"/>
     <w:rPr>
       <w:rFonts w:eastAsiaTheme="majorEastAsia" w:cstheme="majorBidi"/>
       <w:i/>
@@ -1367,7 +1185,7 @@
     <w:link w:val="Heading9"/>
     <w:uiPriority w:val="9"/>
     <w:semiHidden/>
-    <w:rsid w:val="00BE68EB"/>
+    <w:rsid w:val="00D460B1"/>
     <w:rPr>
       <w:rFonts w:eastAsiaTheme="majorEastAsia" w:cstheme="majorBidi"/>
       <w:color w:val="272727" w:themeColor="text1" w:themeTint="D8"/>
@@ -1380,7 +1198,7 @@
     <w:link w:val="TitleChar"/>
     <w:uiPriority w:val="10"/>
     <w:qFormat/>
-    <w:rsid w:val="00BE68EB"/>
+    <w:rsid w:val="00D460B1"/>
     <w:pPr>
       <w:spacing w:after="80" w:line="240" w:lineRule="auto"/>
       <w:contextualSpacing/>
@@ -1398,7 +1216,7 @@
     <w:basedOn w:val="DefaultParagraphFont"/>
     <w:link w:val="Title"/>
     <w:uiPriority w:val="10"/>
-    <w:rsid w:val="00BE68EB"/>
+    <w:rsid w:val="00D460B1"/>
     <w:rPr>
       <w:rFonts w:asciiTheme="majorHAnsi" w:eastAsiaTheme="majorEastAsia" w:hAnsiTheme="majorHAnsi" w:cstheme="majorBidi"/>
       <w:spacing w:val="-10"/>
@@ -1414,7 +1232,7 @@
     <w:link w:val="SubtitleChar"/>
     <w:uiPriority w:val="11"/>
     <w:qFormat/>
-    <w:rsid w:val="00BE68EB"/>
+    <w:rsid w:val="00D460B1"/>
     <w:pPr>
       <w:numPr>
         <w:ilvl w:val="1"/>
@@ -1433,7 +1251,7 @@
     <w:basedOn w:val="DefaultParagraphFont"/>
     <w:link w:val="Subtitle"/>
     <w:uiPriority w:val="11"/>
-    <w:rsid w:val="00BE68EB"/>
+    <w:rsid w:val="00D460B1"/>
     <w:rPr>
       <w:rFonts w:eastAsiaTheme="majorEastAsia" w:cstheme="majorBidi"/>
       <w:color w:val="595959" w:themeColor="text1" w:themeTint="A6"/>
@@ -1449,7 +1267,7 @@
     <w:link w:val="QuoteChar"/>
     <w:uiPriority w:val="29"/>
     <w:qFormat/>
-    <w:rsid w:val="00BE68EB"/>
+    <w:rsid w:val="00D460B1"/>
     <w:pPr>
       <w:spacing w:before="160"/>
       <w:jc w:val="center"/>
@@ -1465,7 +1283,7 @@
     <w:basedOn w:val="DefaultParagraphFont"/>
     <w:link w:val="Quote"/>
     <w:uiPriority w:val="29"/>
-    <w:rsid w:val="00BE68EB"/>
+    <w:rsid w:val="00D460B1"/>
     <w:rPr>
       <w:i/>
       <w:iCs/>
@@ -1477,7 +1295,7 @@
     <w:basedOn w:val="Normal"/>
     <w:uiPriority w:val="34"/>
     <w:qFormat/>
-    <w:rsid w:val="00BE68EB"/>
+    <w:rsid w:val="00D460B1"/>
     <w:pPr>
       <w:ind w:left="720"/>
       <w:contextualSpacing/>
@@ -1488,7 +1306,7 @@
     <w:basedOn w:val="DefaultParagraphFont"/>
     <w:uiPriority w:val="21"/>
     <w:qFormat/>
-    <w:rsid w:val="00BE68EB"/>
+    <w:rsid w:val="00D460B1"/>
     <w:rPr>
       <w:i/>
       <w:iCs/>
@@ -1502,7 +1320,7 @@
     <w:link w:val="IntenseQuoteChar"/>
     <w:uiPriority w:val="30"/>
     <w:qFormat/>
-    <w:rsid w:val="00BE68EB"/>
+    <w:rsid w:val="00D460B1"/>
     <w:pPr>
       <w:pBdr>
         <w:top w:val="single" w:sz="4" w:space="10" w:color="0F4761" w:themeColor="accent1" w:themeShade="BF"/>
@@ -1523,7 +1341,7 @@
     <w:basedOn w:val="DefaultParagraphFont"/>
     <w:link w:val="IntenseQuote"/>
     <w:uiPriority w:val="30"/>
-    <w:rsid w:val="00BE68EB"/>
+    <w:rsid w:val="00D460B1"/>
     <w:rPr>
       <w:i/>
       <w:iCs/>
@@ -1535,7 +1353,7 @@
     <w:basedOn w:val="DefaultParagraphFont"/>
     <w:uiPriority w:val="32"/>
     <w:qFormat/>
-    <w:rsid w:val="00BE68EB"/>
+    <w:rsid w:val="00D460B1"/>
     <w:rPr>
       <w:b/>
       <w:bCs/>

</xml_diff>